<commit_message>
auto: XHS cards — 2026-08-05
</commit_message>
<xml_diff>
--- a/docs/xhs/2026-08-04/历史故事/发布文案.docx
+++ b/docs/xhs/2026-08-04/历史故事/发布文案.docx
@@ -11,7 +11,7 @@
         <w:rPr>
           <w:color w:val="CC3333"/>
         </w:rPr>
-        <w:t>所有历史迷！把这10个典故焊死！</w:t>
+        <w:t>想变通透？看这10个故事就够了</w:t>
       </w:r>
     </w:p>
     <w:p>
@@ -40,25 +40,19 @@
         <w:spacing w:line="384" w:lineRule="auto"/>
       </w:pPr>
       <w:r>
-        <w:t>你敢信？战国时西门豹面对“河伯娶妇”的迷信，微笑着把巫婆和她的弟子全扔进河里，说“去跟河伯报个信”🤯 跟爽文男主比起来，古人狠起来才是真的降维打击。</w:t>
+        <w:t>你知道吗？春节竟然是靠一个民间天文爱好者定下来的！🤯 汉武帝时期，落下闳一个四川阆中的平民，自制浑天仪、测量日影，硬是把正月定为岁首，立春放在新年开头，春节从此诞生。还搞出“十九年七闰”的置闰法，我们现在过的年，竟是他一手拍板的。🔥</w:t>
         <w:br/>
         <w:br/>
-        <w:t>📖 教科书没写透的高能操作，个个都是反杀名场面：</w:t>
+        <w:t>更绝的是，古人吵架都能吵成星星。✨ 帝喾的俩儿子天天打架，老爸直接把他俩分封到商丘和大夏，一个管商星，一个管参星，从此一颗升起另一颗落下，永不相见。“参商永隔”这个成语就这么来的，兄弟失和，天上人间再无重逢。珍惜眼前人啊！📖</w:t>
         <w:br/>
         <w:br/>
-        <w:t>⚔️ 檀道济被北魏大军包围，粮草马上见底，他半夜带着士兵把沙子堆成小山，一边量一边大声报数“几斛几斗”，最后撒上仅剩的一层米。敌军探子一看：好家伙，宋军粮食堆成山，根本不敢攻。心理战玩到极致，一兵未动全身而退。</w:t>
+        <w:t>没有卫星的时代，古人的地图居然画出了等高线？😱 马王堆汉墓出土的《地形图》，山脉用闭合曲线表示，河流比例精准，《驻军图》还标注了部队驻地。两千多年前靠双脚测绘，精度高到让现代人沉默。古人真的没有天花板。🏯</w:t>
         <w:br/>
         <w:br/>
-        <w:t>🏯 朱元璋发给功臣丹书铁券，刻着“卿恕九死，子孙三死”，功臣们以为手握免死金牌。结果“胡蓝之狱”一翻脸，老朱亲笔批示“除谋逆不宥”，照杀不误。原来古代的“铁券”不过是皇权画的一张大饼，随时可以反悔。</w:t>
+        <w:t>被围城射到没箭怎么办？唐朝张巡扎了一千多个草人，套上黑衣夜里从城头放下去，叛军疯狂射箭，轻松收走数十万支。几天后又放真人下去，叛军以为是草人不防备，结果被突袭得手。虚实结合，智慧直接拉满！🤺</w:t>
         <w:br/>
         <w:br/>
-        <w:t>🌌 东汉甘英受命出使大秦（罗马帝国），穿过万里风沙，直抵波斯湾，眼看渡海就能到，却因为当地人一句“顺风也要三个月”选择了回头。虽然没踏上罗马的土地，却带回了当时最完整的西方地理情报。有些路没走完，不代表没有意义。</w:t>
-        <w:br/>
-        <w:br/>
-        <w:t>🔥 这些故事藏着一种狠劲：西门豹用行动破除迷信，檀道济用沙子逆转战局，甘英用脚步拓宽国人的眼界。真正的智慧从来不是纸上谈兵，而是被逼到绝境时还能把沙子卖出米价，把铁券看成一纸空文。</w:t>
-        <w:br/>
-        <w:br/>
-        <w:t>你最想拥有哪个古人的同款智商？或者有没有哪个历史瞬间让你觉得“原来古人才是天花板”？评论区唠一唠👇</w:t>
+        <w:t>这10个故事里，还有宋景公不愿把灾祸转移给臣民、徐光启引入望远镜修历书、虞诩增灶破敌……每一个都藏着认知炸弹。💣 别再说历史枯燥了，这分明是古人留给我们的通关秘籍！你最喜欢哪个操作？评论区唠唠~</w:t>
       </w:r>
     </w:p>
     <w:p>
@@ -74,7 +68,7 @@
         <w:rPr>
           <w:color w:val="CC3333"/>
         </w:rPr>
-        <w:t>#历史故事  #国学智慧  #古人智慧  #每天学点历史  #传统文化  #格局打开  #认知升级  #冷知识</w:t>
+        <w:t>#历史故事  #国学智慧  #古人智慧  #冷知识  #传统文化  #认知升级  #自我提升</w:t>
       </w:r>
     </w:p>
     <w:p>
@@ -91,7 +85,7 @@
           <w:b/>
           <w:sz w:val="32"/>
         </w:rPr>
-        <w:t>太野了！古人</w:t>
+        <w:t>格局炸裂</w:t>
       </w:r>
     </w:p>
     <w:p>
@@ -118,7 +112,7 @@
         <w:spacing w:line="336" w:lineRule="auto"/>
       </w:pPr>
       <w:r>
-        <w:t>💡 星空中的神话承载了古人朴素的地理分野观念，也寓示着人与人的缘分有时就像星辰运行，错过便再难相遇。</w:t>
+        <w:t>💡 兄弟失和终成永隔，珍惜眼前人与亲情，莫让纷争造成无法弥补的遗憾。</w:t>
       </w:r>
     </w:p>
     <w:p/>
@@ -130,7 +124,7 @@
         <w:rPr>
           <w:sz w:val="24"/>
         </w:rPr>
-        <w:t>#2  西汉 · 落下闳创《太初历》定春节  [古代天文地理]</w:t>
+        <w:t>#2  春秋 · 荧惑守心与宋景公不移祸  [古代天文地理]</w:t>
       </w:r>
     </w:p>
     <w:p>
@@ -138,7 +132,7 @@
         <w:spacing w:line="336" w:lineRule="auto"/>
       </w:pPr>
       <w:r>
-        <w:t>💡 一部精确的历法背后是长期的观测与推算，它奠定了农业社会的节律，也塑造了中国人传承至今的年俗。</w:t>
+        <w:t>💡 身为一国之君，宁肯自己承担灾祸也不转移给他人，仁德之心能感天动地。</w:t>
       </w:r>
     </w:p>
     <w:p/>
@@ -150,7 +144,7 @@
         <w:rPr>
           <w:sz w:val="24"/>
         </w:rPr>
-        <w:t>#3  战国 · 西门豹治邺修渠  [古代天文地理]</w:t>
+        <w:t>#3  西汉 · 落下闳巧定太初历  [古代天文地理]</w:t>
       </w:r>
     </w:p>
     <w:p>
@@ -158,7 +152,7 @@
         <w:spacing w:line="336" w:lineRule="auto"/>
       </w:pPr>
       <w:r>
-        <w:t>💡 破除迷信要靠实地行动，而真正惠民的水利工程，会福泽千载，赢得世代尊敬。</w:t>
+        <w:t>💡 真才实学不问出身，民间智慧同样可以成就流传千古的伟大创造。</w:t>
       </w:r>
     </w:p>
     <w:p/>
@@ -170,7 +164,7 @@
         <w:rPr>
           <w:sz w:val="24"/>
         </w:rPr>
-        <w:t>#4  北魏 · 郦道元著《水经注》  [古代天文地理]</w:t>
+        <w:t>#4  西周 · 周公测影定地中  [古代天文地理]</w:t>
       </w:r>
     </w:p>
     <w:p>
@@ -178,7 +172,7 @@
         <w:spacing w:line="336" w:lineRule="auto"/>
       </w:pPr>
       <w:r>
-        <w:t>💡 把实地观察与文献考订结合，才能揭示山川的真面目，这种科学精神使《水经注》成为不朽的地理经典。</w:t>
+        <w:t>💡 精确测量是决策的基础，古人通过严谨的观测，确立了一个国家的中心。</w:t>
       </w:r>
     </w:p>
     <w:p/>
@@ -190,7 +184,7 @@
         <w:rPr>
           <w:sz w:val="24"/>
         </w:rPr>
-        <w:t>#5  北宋 · 天关客星  [古代天文地理]</w:t>
+        <w:t>#5  西汉 · 马王堆古地图：汉代的高精度测绘  [古代天文地理]</w:t>
       </w:r>
     </w:p>
     <w:p>
@@ -198,7 +192,7 @@
         <w:spacing w:line="336" w:lineRule="auto"/>
       </w:pPr>
       <w:r>
-        <w:t>💡 古人看似枯燥的天象记录，却是留给后世的科学遗产，提醒我们需要珍视每一份脚踏实地的观测。</w:t>
+        <w:t>💡 古代科技并非原始，许多成就远超我们想象，实证让我们重新认识先人的智慧。</w:t>
       </w:r>
     </w:p>
     <w:p/>
@@ -210,7 +204,7 @@
         <w:rPr>
           <w:sz w:val="24"/>
         </w:rPr>
-        <w:t>#6  东汉 · 甘英出使大秦  [古代天文地理]</w:t>
+        <w:t>#6  明 · 徐光启与《崇祯历书》  [古代天文地理]</w:t>
       </w:r>
     </w:p>
     <w:p>
@@ -218,7 +212,7 @@
         <w:spacing w:line="336" w:lineRule="auto"/>
       </w:pPr>
       <w:r>
-        <w:t>💡 探索世界的勇气值得敬佩，即便未达目标，每一次靠近都在拓宽认知的边界。</w:t>
+        <w:t>💡 敢于打破门户之见，吸纳一切先进知识，才能推动真正的进步。</w:t>
       </w:r>
     </w:p>
     <w:p/>
@@ -230,7 +224,7 @@
         <w:rPr>
           <w:sz w:val="24"/>
         </w:rPr>
-        <w:t>#7  东汉 · 虞诩增灶计  [兵法谋略故事]</w:t>
+        <w:t>#7  明 · 尚方宝剑：先斩后奏的真相  [历史趣考]</w:t>
       </w:r>
     </w:p>
     <w:p>
@@ -238,7 +232,7 @@
         <w:spacing w:line="336" w:lineRule="auto"/>
       </w:pPr>
       <w:r>
-        <w:t>💡 兵无常势，水无常形，真正的智慧在于根据实事灵活变通，不拘泥于成法。</w:t>
+        <w:t>💡 流行文化往往夸大了历史道具的作用，了解真实制度，才能避免以讹传讹。</w:t>
       </w:r>
     </w:p>
     <w:p/>
@@ -250,7 +244,7 @@
         <w:rPr>
           <w:sz w:val="24"/>
         </w:rPr>
-        <w:t>#8  南朝·宋 · 檀道济唱筹量沙  [兵法谋略故事]</w:t>
+        <w:t>#8  唐 · 唐代美女真的是以胖为美吗？  [历史趣考]</w:t>
       </w:r>
     </w:p>
     <w:p>
@@ -258,7 +252,7 @@
         <w:spacing w:line="336" w:lineRule="auto"/>
       </w:pPr>
       <w:r>
-        <w:t>💡 在极端困境中，镇定、机智的心理战比刀枪更能扭转危局，真正的将才赢在智慧。</w:t>
+        <w:t>💡 审美是时代塑造的，要用发展的眼光看待古人记录，不以后见之明简单标签化。</w:t>
       </w:r>
     </w:p>
     <w:p/>
@@ -270,7 +264,7 @@
         <w:rPr>
           <w:sz w:val="24"/>
         </w:rPr>
-        <w:t>#9  明 · 丹书铁券不免死  [历史趣考]</w:t>
+        <w:t>#9  东汉 · 虞诩增灶破羌  [兵法谋略]</w:t>
       </w:r>
     </w:p>
     <w:p>
@@ -278,7 +272,7 @@
         <w:spacing w:line="336" w:lineRule="auto"/>
       </w:pPr>
       <w:r>
-        <w:t>💡 古代封赏的铁券看似特权，实则不过是皇权时代的镜花水月，法律保障远不如制度约束来得可靠。</w:t>
+        <w:t>💡 兵法贵在变通，根据实际情况灵活改变策略，才能克敌制胜。</w:t>
       </w:r>
     </w:p>
     <w:p/>
@@ -290,7 +284,7 @@
         <w:rPr>
           <w:sz w:val="24"/>
         </w:rPr>
-        <w:t>#10  晋/宋 · 记里鼓车  [历史趣考]</w:t>
+        <w:t>#10  唐 · 张巡草人借箭  [兵法谋略]</w:t>
       </w:r>
     </w:p>
     <w:p>
@@ -298,7 +292,7 @@
         <w:spacing w:line="336" w:lineRule="auto"/>
       </w:pPr>
       <w:r>
-        <w:t>💡 中国古代机械智慧的细节一度被埋没，重新发现它们，才能完整理解当时科技的高度。</w:t>
+        <w:t>💡 在困境中用智慧创造资源，虚实结合，往往能以弱胜强。</w:t>
       </w:r>
     </w:p>
     <w:p/>

</xml_diff>